<commit_message>
Add LINE OUT option case STL, update Ear manual and README
既存の標準筐体 karipom_hip.stl（PCM1808＋Pico2収納）に、3.5mm LINE OUTジャック用の開口を追加したオプション版 karipom_hip_lineout.stl を追加。

- 3d_models/stl/karipom_hip_lineout.stl: 新規追加。karipom_hip.stlの派生モデル（バウンディングボックス一致を確認済み）。LINE OUT増設時のみ使用するオプション版で、標準構成では従来どおりkaripom_hip.stlを使用する。
- Karipom Ear設計・製作マニュアル: 11.3・11.6に、標準／LINE OUTオプションの関係を明記。Ver.2.2→2.3。既存のLINE OUT回路・写真・注意事項等は変更なし。
- README.md: 3Dモデル節に、標準（karipom_hip.stl）／LINE OUTオプション（karipom_hip_lineout.stl）の位置づけを簡潔に追記。
- 上記mdから既存のpandoc方式でdocxを再生成。

karipom_hip.stl・karipom.3mf・その他既存STL・karipom_cores3.inoはいずれも無変更。
</commit_message>
<xml_diff>
--- a/docs/pcm1808_pico2/PCM1808_Pico2_設計マニュアル.docx
+++ b/docs/pcm1808_pico2/PCM1808_Pico2_設計マニュアル.docx
@@ -81,7 +81,7 @@
         <w:t xml:space="preserve"> </w:t>
       </w:r>
       <w:r>
-        <w:t xml:space="preserve">2.2</w:t>
+        <w:t xml:space="preserve">2.3</w:t>
       </w:r>
     </w:p>
     <w:p>
@@ -7652,7 +7652,7 @@
         <w:pStyle w:val="Compact"/>
       </w:pPr>
       <w:r>
-        <w:t xml:space="preserve">筐体（Fusion 360）側のジャック取り付け穴の設計（必要になったら別途）</w:t>
+        <w:t xml:space="preserve">筐体（Fusion 360）側の設計・製作（LINE OUT用開口を追加したオプション版STLを公開しています。11.6参照）</w:t>
       </w:r>
     </w:p>
     <w:p>
@@ -9461,6 +9461,65 @@
       </w:r>
       <w:r>
         <w:t xml:space="preserve">：この回路はそのまま流用できます。MH-M18を追加するときは、CN3の手前に入力切替回路を挿し込むだけで、470Ωから先には一切手を加えません。今回の作業は無駄になりません。</w:t>
+      </w:r>
+    </w:p>
+    <w:p>
+      <w:pPr>
+        <w:pStyle w:val="BodyText"/>
+      </w:pPr>
+      <w:r>
+        <w:t xml:space="preserve">💡</w:t>
+      </w:r>
+      <w:r>
+        <w:t xml:space="preserve"> </w:t>
+      </w:r>
+      <w:r>
+        <w:rPr>
+          <w:b/>
+        </w:rPr>
+        <w:t xml:space="preserve">LINE OUT対応筐体STLを公開しています</w:t>
+      </w:r>
+      <w:r>
+        <w:t xml:space="preserve">：PCM1808＋Pico2を収納する筐体（</w:t>
+      </w:r>
+      <w:r>
+        <w:rPr>
+          <w:rStyle w:val="VerbatimChar"/>
+        </w:rPr>
+        <w:t xml:space="preserve">3d_models/stl/karipom_hip.stl</w:t>
+      </w:r>
+      <w:r>
+        <w:t xml:space="preserve">）に、3.5mm LINE OUTジャック用の開口を追加したオプション版</w:t>
+      </w:r>
+      <w:r>
+        <w:t xml:space="preserve"> </w:t>
+      </w:r>
+      <w:r>
+        <w:rPr>
+          <w:rStyle w:val="VerbatimChar"/>
+        </w:rPr>
+        <w:t xml:space="preserve">karipom_hip_lineout.stl</w:t>
+      </w:r>
+      <w:r>
+        <w:t xml:space="preserve"> </w:t>
+      </w:r>
+      <w:r>
+        <w:t xml:space="preserve">を公開しています。LINE OUTを増設しない標準構成では、従来どおり</w:t>
+      </w:r>
+      <w:r>
+        <w:t xml:space="preserve"> </w:t>
+      </w:r>
+      <w:r>
+        <w:rPr>
+          <w:rStyle w:val="VerbatimChar"/>
+        </w:rPr>
+        <w:t xml:space="preserve">karipom_hip.stl</w:t>
+      </w:r>
+      <w:r>
+        <w:t xml:space="preserve"> </w:t>
+      </w:r>
+      <w:r>
+        <w:t xml:space="preserve">を使用してください。LINE OUTを増設する場合は、こちらのオプション版をご利用ください。</w:t>
       </w:r>
     </w:p>
     <w:p>

</xml_diff>